<commit_message>
Consistency pass: trial=300 in app (default quota 300 everywhere), top plan named Agency everywhere (landing/workspace/admin/ToS/docx), FraudGraph listed on both Starter and Pro, support email = shekhar.chlear@gmail.com in app + terms + landing, docx regenerated
</commit_message>
<xml_diff>
--- a/docs/AdGuard_Management_Proposal_Oct2026.docx
+++ b/docs/AdGuard_Management_Proposal_Oct2026.docx
@@ -172,7 +172,7 @@
         <w:spacing w:after="40"/>
       </w:pPr>
       <w:r>
-        <w:t>Trial + Starter + Pro + Enterprise plans provisioned automatically; plan rules enforced in-product.</w:t>
+        <w:t>Trial + Starter + Pro + Agency plans provisioned automatically; plan rules enforced in-product.</w:t>
       </w:r>
     </w:p>
     <w:p>
@@ -223,7 +223,7 @@
           <w:b w:val="0"/>
           <w:sz w:val="21"/>
         </w:rPr>
-        <w:t>Payments. Plan selection currently works but the payment step is bypassed for beta — a customer clicking “Choose Starter” gets the workspace without paying. Razorpay LIVE activation is the single remaining blocker between the product and its first rupee of revenue.</w:t>
+        <w:t>Payments. Plan selection currently works but the payment step is bypassed for beta — a customer clicking "Choose Starter" gets the workspace without paying. Razorpay LIVE activation is the single remaining blocker between the product and its first rupee of revenue.</w:t>
       </w:r>
     </w:p>
     <w:tbl>
@@ -363,7 +363,7 @@
           <w:b w:val="0"/>
           <w:sz w:val="21"/>
         </w:rPr>
-        <w:t>The journey: marketer connects Google/Meta via official OAuth → leads flow into AdGuard's audit pipeline → each lead is device-fingerprinted, deduplicated, geo-checked, email/phone validated and AI-scored in ~2 seconds → verified leads reach the CRM, junk leads are blocked with evidence → Money Shield auto-pauses campaigns that attract junk → weekly reports show recovered spend in ₹.</w:t>
+        <w:t>The journey: marketer connects Google/Meta via official OAuth â†’ leads flow into AdGuard's audit pipeline â†’ each lead is device-fingerprinted, deduplicated, geo-checked, email/phone validated and AI-scored in ~2 seconds â†’ verified leads reach the CRM, junk leads are blocked with evidence â†’ Money Shield auto-pauses campaigns that attract junk â†’ weekly reports show recovered spend in ₹.</w:t>
       </w:r>
     </w:p>
     <w:p>
@@ -469,7 +469,7 @@
           <w:color w:val="57534E"/>
           <w:sz w:val="17"/>
         </w:rPr>
-        <w:t>Fig 2.2 — How it works: connect → screen → shield → CRM</w:t>
+        <w:t>Fig 2.2 — How it works: connect â†’ screen â†’ shield â†’ CRM</w:t>
       </w:r>
     </w:p>
     <w:p>
@@ -887,7 +887,7 @@
               <w:rPr>
                 <w:sz w:val="19"/>
               </w:rPr>
-              <w:t>Self-serve signup + email journey (verify → password → welcome)</w:t>
+              <w:t>Self-serve signup + email journey (verify â†’ password â†’ welcome)</w:t>
             </w:r>
           </w:p>
         </w:tc>
@@ -1073,7 +1073,7 @@
               <w:rPr>
                 <w:sz w:val="19"/>
               </w:rPr>
-              <w:t>Prepaid call-verification credits (Pro 300 / Enterprise 500)</w:t>
+              <w:t>Prepaid call-verification credits (Pro 300 / Agency 500)</w:t>
             </w:r>
           </w:p>
         </w:tc>
@@ -1180,7 +1180,7 @@
               <w:rPr>
                 <w:sz w:val="19"/>
               </w:rPr>
-              <w:t>PARKED (Enterprise roadmap)</w:t>
+              <w:t>PARKED (Agency roadmap)</w:t>
             </w:r>
           </w:p>
         </w:tc>
@@ -1263,7 +1263,7 @@
         <w:spacing w:after="40"/>
       </w:pPr>
       <w:r>
-        <w:t>Worse: when Meta/Google “learn” from fake leads, their optimisation findsmore fake leads — the waste compounds every week.</w:t>
+        <w:t>Worse: when Meta/Google "learn" from fake leads, their optimisation finds more fake leads — the waste compounds every week.</w:t>
       </w:r>
     </w:p>
     <w:p>
@@ -1695,7 +1695,7 @@
               <w:rPr>
                 <w:sz w:val="19"/>
               </w:rPr>
-              <w:t>Enterprise</w:t>
+              <w:t>Agency</w:t>
             </w:r>
           </w:p>
         </w:tc>
@@ -1879,7 +1879,7 @@
         <w:spacing w:after="40"/>
       </w:pPr>
       <w:r>
-        <w:t>Connection limits (1 Google + 1 Meta) enforced at OAuth; upsell path to Enterprise is in-product.</w:t>
+        <w:t>Connection limits (1 Google + 1 Meta) enforced at OAuth; upsell path to Agency is in-product.</w:t>
       </w:r>
     </w:p>
     <w:p>
@@ -2229,7 +2229,7 @@
               <w:rPr>
                 <w:sz w:val="19"/>
               </w:rPr>
-              <w:t>Enterprise (10 ws + 500 calls)</w:t>
+              <w:t>Agency (10 ws + 500 calls)</w:t>
             </w:r>
           </w:p>
         </w:tc>
@@ -2306,7 +2306,7 @@
           <w:color w:val="57534E"/>
           <w:sz w:val="18"/>
         </w:rPr>
-        <w:t>*Variable = compute, storage growth, 30 min support. Gateway adds 2% of revenue (Razorpay). AI-call cost sits inside the plans' call bundles (Samvaad ~₹2–4/call; prepaid packs retail at ₹6–8/call — 33–50% margin on top-ups).</w:t>
+        <w:t>*Variable = compute, storage growth, 30 min support. Gateway adds 2% of revenue (Razorpay). AI-call cost sits inside the plans' call bundles (Samvaad ~₹2â€“4/call; prepaid packs retail at ₹6â€“8/call — 33â€“50% margin on top-ups).</w:t>
       </w:r>
     </w:p>
     <w:p>
@@ -2389,7 +2389,7 @@
               <w:rPr>
                 <w:sz w:val="19"/>
               </w:rPr>
-              <w:t>2,000–3,500</w:t>
+              <w:t>2,000â€“3,500</w:t>
             </w:r>
           </w:p>
         </w:tc>
@@ -2406,7 +2406,7 @@
               <w:rPr>
                 <w:sz w:val="19"/>
               </w:rPr>
-              <w:t>Supabase Postgres (free tier → Pro at growth)</w:t>
+              <w:t>Supabase Postgres (free tier â†’ Pro at growth)</w:t>
             </w:r>
           </w:p>
         </w:tc>
@@ -2421,7 +2421,7 @@
               <w:rPr>
                 <w:sz w:val="19"/>
               </w:rPr>
-              <w:t>0–2,100</w:t>
+              <w:t>0â€“2,100</w:t>
             </w:r>
           </w:p>
         </w:tc>
@@ -2483,7 +2483,7 @@
               <w:rPr>
                 <w:sz w:val="19"/>
               </w:rPr>
-              <w:t>≈ ₹3,000–5,000</w:t>
+              <w:t>â‰ˆ ₹3,000â€“5,000</w:t>
             </w:r>
           </w:p>
         </w:tc>
@@ -2560,7 +2560,7 @@
               <w:rPr>
                 <w:sz w:val="19"/>
               </w:rPr>
-              <w:t>Revenue: 10 Starter + 4 Pro + 2 Enterprise</w:t>
+              <w:t>Revenue: 10 Starter + 4 Pro + 2 Agency</w:t>
             </w:r>
           </w:p>
         </w:tc>
@@ -2698,7 +2698,7 @@
               <w:rPr>
                 <w:sz w:val="19"/>
               </w:rPr>
-              <w:t>≈₹1,18,000 → ~62% net margin</w:t>
+              <w:t>â‰ˆ₹1,18,000 â†’ ~62% net margin</w:t>
             </w:r>
           </w:p>
         </w:tc>
@@ -2813,7 +2813,7 @@
               <w:rPr>
                 <w:sz w:val="19"/>
               </w:rPr>
-              <w:t>6–8 subscribers (~₹65–70k MRR)</w:t>
+              <w:t>6â€“8 subscribers (~₹65â€“70k MRR)</w:t>
             </w:r>
           </w:p>
         </w:tc>
@@ -2843,7 +2843,7 @@
               <w:rPr>
                 <w:sz w:val="19"/>
               </w:rPr>
-              <w:t>Founder-run: 1–2 subscribers = already cash-positive</w:t>
+              <w:t>Founder-run: 1â€“2 subscribers = already cash-positive</w:t>
             </w:r>
           </w:p>
         </w:tc>
@@ -2893,7 +2893,7 @@
         <w:spacing w:after="40"/>
       </w:pPr>
       <w:r>
-        <w:t>Checkout: customer picks Starter/Pro/Enterprise → Razorpay (UPI, cards, netbanking, wallets) → subscription active instantly, no manual UPI transfers and no support tickets.</w:t>
+        <w:t>Checkout: customer picks Starter/Pro/Agency â†’ Razorpay (UPI, cards, netbanking, wallets) â†’ subscription active instantly, no manual UPI transfers and no support tickets.</w:t>
       </w:r>
     </w:p>
     <w:p>
@@ -2911,7 +2911,7 @@
         <w:spacing w:after="40"/>
       </w:pPr>
       <w:r>
-        <w:t>Prepaid call-pack purchases inside the workspace (Buy Calls → Razorpay checkout → instant credit).</w:t>
+        <w:t>Prepaid call-pack purchases inside the workspace (Buy Calls â†’ Razorpay checkout â†’ instant credit).</w:t>
       </w:r>
     </w:p>
     <w:p>
@@ -3099,7 +3099,7 @@
               <w:rPr>
                 <w:sz w:val="19"/>
               </w:rPr>
-              <w:t>~1.75–2%</w:t>
+              <w:t>~1.75â€“2%</w:t>
             </w:r>
           </w:p>
         </w:tc>
@@ -3369,7 +3369,7 @@
               <w:rPr>
                 <w:sz w:val="19"/>
               </w:rPr>
-              <w:t>2–7 working days</w:t>
+              <w:t>2â€“7 working days</w:t>
             </w:r>
           </w:p>
         </w:tc>
@@ -3617,7 +3617,7 @@
               <w:rPr>
                 <w:sz w:val="19"/>
               </w:rPr>
-              <w:t>Trial → paid conversion</w:t>
+              <w:t>Trial â†’ paid conversion</w:t>
             </w:r>
           </w:p>
         </w:tc>
@@ -3755,7 +3755,7 @@
               <w:rPr>
                 <w:sz w:val="19"/>
               </w:rPr>
-              <w:t>₹15–20L cumulative</w:t>
+              <w:t>₹15â€“20L cumulative</w:t>
             </w:r>
           </w:p>
         </w:tc>
@@ -3837,7 +3837,7 @@
               <w:rPr>
                 <w:sz w:val="19"/>
               </w:rPr>
-              <w:t>Subscriber legal claim: “you didn't really audit”</w:t>
+              <w:t>Subscriber legal claim: 'you did not really audit'</w:t>
             </w:r>
           </w:p>
         </w:tc>
@@ -4373,7 +4373,7 @@
           <w:b/>
           <w:sz w:val="24"/>
         </w:rPr>
-        <w:t>“One mid-size Meta lead-gen client wastes ₹20,000–50,000 every month on junk leads. AdGuard charges ₹4,999 to stop it — with proof in rupees the client can see. The math sells the product. The only thing between us and the market is a Razorpay activation.”</w:t>
+        <w:t>"One mid-size Meta lead-gen client wastes ₹20,000–50,000 every month on junk leads. AdGuard charges ₹4,999 to stop it — with proof in rupees the client can see. The math sells the product. The only thing between us and the market is a Razorpay activation."</w:t>
       </w:r>
     </w:p>
     <w:p>

</xml_diff>